<commit_message>
Replace em/en dash separators with commas
Swap the parenthetical dash separators for commas in the summary,
the Mercury team bullet, and the F5 internal tools bullet, and
write the 200-300 range out in words. Leaves the pre-existing en
dashes alone: the page title, the AI/ML job title, and the 1999-2003
degree range.

Regenerate the Word version from the updated HTML.

Co-Authored-By: Claude Opus 5 <noreply@anthropic.com>
</commit_message>
<xml_diff>
--- a/Todd_Jones_Resume.docx
+++ b/Todd_Jones_Resume.docx
@@ -66,7 +66,7 @@
         <w:spacing w:after="80"/>
       </w:pPr>
       <w:r>
-        <w:t>Engineering leader who builds the foundational platform services other teams depend on. I currently lead two teams at Mercury – Backend Developer Experience and Release Engineering – delivering distributed build systems, CI/CD platforms, and developer tooling to more than 300 engineers. Across my career I have owned shared services and internal platforms serving 200–300+ engineers, grown and mentored high-performing teams, and driven organization-wide adoption of AI and LLM-assisted development. My expertise spans distributed systems architecture, Kubernetes, CI/CD, observability and distributed tracing, DORA metrics, and secure software delivery. I care most about building platforms that other teams actively choose to build on, and about helping engineers understand and own the business impact of their work.</w:t>
+        <w:t>Engineering leader who builds the foundational platform services other teams depend on. I currently lead two teams at Mercury, Backend Developer Experience and Release Engineering, delivering distributed build systems, CI/CD platforms, and developer tooling to more than 300 engineers. Across my career I have owned shared services and internal platforms serving 200 to 300+ engineers, grown and mentored high-performing teams, and driven organization-wide adoption of AI and LLM-assisted development. My expertise spans distributed systems architecture, Kubernetes, CI/CD, observability and distributed tracing, DORA metrics, and secure software delivery. I care most about building platforms that other teams actively choose to build on, and about helping engineers understand and own the business impact of their work.</w:t>
       </w:r>
     </w:p>
     <w:p>
@@ -244,7 +244,7 @@
         <w:rPr>
           <w:sz w:val="21"/>
         </w:rPr>
-        <w:t>Lead two teams – Backend Developer Experience and Release Engineering – owning the build, test, and release platforms that over 300 backend engineers depend on every day.</w:t>
+        <w:t>Lead two teams, Backend Developer Experience and Release Engineering, owning the build, test, and release platforms that over 300 backend engineers depend on every day.</w:t>
       </w:r>
     </w:p>
     <w:p>
@@ -562,7 +562,7 @@
         <w:rPr>
           <w:sz w:val="21"/>
         </w:rPr>
-        <w:t>Designed and developed internal tools critical to F5 product development and testing, including a test result reporting site, a centralized logging system, and a big data reporting web app – built on JavaScript/TypeScript services with AngularJS front ends, later migrating toward React.</w:t>
+        <w:t>Designed and developed internal tools critical to F5 product development and testing, including a test result reporting site, a centralized logging system, and a big data reporting web app, built on JavaScript/TypeScript services with AngularJS front ends, later migrating toward React.</w:t>
       </w:r>
     </w:p>
     <w:p>

</xml_diff>

<commit_message>
Add developer platform specifics and manager mentoring
- Name the CI platforms (GitHub Actions, GitLab CI) and clouds (AWS,
  Azure) rather than describing them generically, and add internal
  developer portals and progressive delivery (canary, blue/green).
  All four are named in the Alteryx posting's preferred experience.
- Record mentoring new and aspiring managers through the
  manager-in-training program. Placed second so the people and org
  signal sits above the quantified platform wins, since that posting
  lists mentoring managers as a responsibility.

Left off deliberately: ArgoCD and Flux (practices are manual today,
adoption is a year out), GitOps as a term (practice without the
tooling), Buildkite (still being evaluated), and SPACE.

Co-Authored-By: Claude Opus 5 <noreply@anthropic.com>
</commit_message>
<xml_diff>
--- a/Todd_Jones_Resume.docx
+++ b/Todd_Jones_Resume.docx
@@ -117,7 +117,7 @@
         <w:rPr>
           <w:sz w:val="21"/>
         </w:rPr>
-        <w:t>CI/CD and release engineering, distributed build systems (Buck2, Bazel-style), test infrastructure and frameworks, developer productivity tooling, DORA metrics, observability and distributed tracing, alerting &amp; SLOs</w:t>
+        <w:t>CI/CD and release engineering (GitHub Actions, GitLab CI), distributed build systems (Buck2, Bazel-style), test infrastructure and frameworks, internal developer portals, progressive delivery (canary, blue/green), developer productivity tooling, DORA metrics, observability and distributed tracing, alerting &amp; SLOs</w:t>
       </w:r>
     </w:p>
     <w:p>
@@ -136,7 +136,7 @@
         <w:rPr>
           <w:sz w:val="21"/>
         </w:rPr>
-        <w:t>Kubernetes, service mesh, cloud infrastructure</w:t>
+        <w:t>Kubernetes, AWS, Azure, service mesh, cloud infrastructure</w:t>
       </w:r>
     </w:p>
     <w:p>
@@ -264,6 +264,18 @@
           <w:sz w:val="21"/>
         </w:rPr>
         <w:t>Lead two teams, Backend Developer Experience and Release Engineering, owning the build, test, and release platforms that over 300 backend engineers depend on every day. Both teams are senior by design, with engineers acting as technical leads for their own areas of the platform.</w:t>
+      </w:r>
+    </w:p>
+    <w:p>
+      <w:pPr>
+        <w:pStyle w:val="ListBullet"/>
+        <w:spacing w:after="40"/>
+      </w:pPr>
+      <w:r>
+        <w:rPr>
+          <w:sz w:val="21"/>
+        </w:rPr>
+        <w:t>Mentor new and aspiring managers through the manager-in-training program, meeting regularly with several managers outside my own reporting line.</w:t>
       </w:r>
     </w:p>
     <w:p>

</xml_diff>